<commit_message>
Automatización de control de pagos en administrativos
</commit_message>
<xml_diff>
--- a/data/modelos/control_pagos_primera.docx
+++ b/data/modelos/control_pagos_primera.docx
@@ -245,11 +245,11 @@
         <w:tblLook w:val="04A0" w:firstRow="1" w:lastRow="0" w:firstColumn="1" w:lastColumn="0" w:noHBand="0" w:noVBand="1"/>
       </w:tblPr>
       <w:tblGrid>
-        <w:gridCol w:w="1408"/>
-        <w:gridCol w:w="1941"/>
-        <w:gridCol w:w="2945"/>
+        <w:gridCol w:w="1423"/>
+        <w:gridCol w:w="1942"/>
+        <w:gridCol w:w="2994"/>
         <w:gridCol w:w="1561"/>
-        <w:gridCol w:w="1644"/>
+        <w:gridCol w:w="1579"/>
       </w:tblGrid>
       <w:tr>
         <w:trPr>
@@ -679,7 +679,7 @@
                 <w:sz w:val="24"/>
                 <w:szCs w:val="24"/>
               </w:rPr>
-              <w:t>Saldo_Restante</w:t>
+              <w:t>Saldo_Primera</w:t>
             </w:r>
             <w:proofErr w:type="spellEnd"/>
           </w:p>

</xml_diff>

<commit_message>
Actualización para generación hasta sexta armada de documentos docentes.
</commit_message>
<xml_diff>
--- a/data/modelos/control_pagos_primera.docx
+++ b/data/modelos/control_pagos_primera.docx
@@ -81,7 +81,6 @@
         </w:rPr>
         <w:t xml:space="preserve">º </w:t>
       </w:r>
-      <w:proofErr w:type="spellStart"/>
       <w:r>
         <w:rPr>
           <w:rFonts w:ascii="Garamond" w:hAnsi="Garamond"/>
@@ -91,7 +90,6 @@
         </w:rPr>
         <w:t>numero_contrato</w:t>
       </w:r>
-      <w:proofErr w:type="spellEnd"/>
       <w:r>
         <w:rPr>
           <w:rFonts w:ascii="Garamond" w:hAnsi="Garamond"/>
@@ -188,7 +186,6 @@
         </w:rPr>
         <w:t xml:space="preserve">Servicio de dictado de clases virtuales y diseño de exámenes de </w:t>
       </w:r>
-      <w:proofErr w:type="spellStart"/>
       <w:r>
         <w:rPr>
           <w:rFonts w:ascii="Garamond" w:hAnsi="Garamond"/>
@@ -198,7 +195,6 @@
         </w:rPr>
         <w:t>Idioma_Docente</w:t>
       </w:r>
-      <w:proofErr w:type="spellEnd"/>
       <w:r>
         <w:rPr>
           <w:rFonts w:ascii="Garamond" w:hAnsi="Garamond"/>
@@ -245,11 +241,11 @@
         <w:tblLook w:val="04A0" w:firstRow="1" w:lastRow="0" w:firstColumn="1" w:lastColumn="0" w:noHBand="0" w:noVBand="1"/>
       </w:tblPr>
       <w:tblGrid>
-        <w:gridCol w:w="1423"/>
-        <w:gridCol w:w="1942"/>
-        <w:gridCol w:w="2994"/>
-        <w:gridCol w:w="1561"/>
-        <w:gridCol w:w="1579"/>
+        <w:gridCol w:w="1479"/>
+        <w:gridCol w:w="1939"/>
+        <w:gridCol w:w="3166"/>
+        <w:gridCol w:w="1450"/>
+        <w:gridCol w:w="1465"/>
       </w:tblGrid>
       <w:tr>
         <w:trPr>
@@ -412,15 +408,11 @@
             <w:pPr>
               <w:rPr>
                 <w:rFonts w:ascii="Garamond" w:hAnsi="Garamond"/>
-                <w:sz w:val="24"/>
-                <w:szCs w:val="24"/>
               </w:rPr>
             </w:pPr>
             <w:r>
               <w:rPr>
                 <w:rFonts w:ascii="Garamond" w:hAnsi="Garamond"/>
-                <w:sz w:val="24"/>
-                <w:szCs w:val="24"/>
               </w:rPr>
               <w:t>1</w:t>
             </w:r>
@@ -435,20 +427,14 @@
             <w:pPr>
               <w:rPr>
                 <w:rFonts w:ascii="Garamond" w:hAnsi="Garamond"/>
-                <w:sz w:val="24"/>
-                <w:szCs w:val="24"/>
               </w:rPr>
             </w:pPr>
-            <w:proofErr w:type="spellStart"/>
             <w:r>
               <w:rPr>
                 <w:rFonts w:ascii="Garamond" w:hAnsi="Garamond"/>
-                <w:sz w:val="24"/>
-                <w:szCs w:val="24"/>
               </w:rPr>
               <w:t>Nombre_Docente</w:t>
             </w:r>
-            <w:proofErr w:type="spellEnd"/>
           </w:p>
         </w:tc>
         <w:tc>
@@ -463,47 +449,35 @@
             <w:pPr>
               <w:rPr>
                 <w:rFonts w:ascii="Garamond" w:hAnsi="Garamond"/>
-                <w:sz w:val="24"/>
-                <w:szCs w:val="24"/>
               </w:rPr>
             </w:pPr>
             <w:r>
               <w:rPr>
                 <w:rFonts w:ascii="Garamond" w:hAnsi="Garamond"/>
-                <w:sz w:val="24"/>
-                <w:szCs w:val="24"/>
               </w:rPr>
               <w:t>N.º</w:t>
             </w:r>
             <w:r>
               <w:rPr>
                 <w:rFonts w:ascii="Garamond" w:hAnsi="Garamond"/>
-                <w:sz w:val="24"/>
-                <w:szCs w:val="24"/>
               </w:rPr>
               <w:t xml:space="preserve"> </w:t>
             </w:r>
             <w:r>
               <w:rPr>
                 <w:rFonts w:ascii="Garamond" w:hAnsi="Garamond"/>
-                <w:sz w:val="24"/>
-                <w:szCs w:val="24"/>
               </w:rPr>
               <w:t>______</w:t>
             </w:r>
             <w:r>
               <w:rPr>
                 <w:rFonts w:ascii="Garamond" w:hAnsi="Garamond"/>
-                <w:sz w:val="24"/>
-                <w:szCs w:val="24"/>
               </w:rPr>
               <w:t>-</w:t>
             </w:r>
             <w:r>
               <w:rPr>
                 <w:rFonts w:ascii="Garamond" w:hAnsi="Garamond"/>
-                <w:sz w:val="24"/>
-                <w:szCs w:val="24"/>
               </w:rPr>
               <w:t>2026-DECEID-D-FLCH/UNMSM</w:t>
             </w:r>
@@ -521,20 +495,14 @@
             <w:pPr>
               <w:rPr>
                 <w:rFonts w:ascii="Garamond" w:hAnsi="Garamond"/>
-                <w:sz w:val="24"/>
-                <w:szCs w:val="24"/>
               </w:rPr>
             </w:pPr>
-            <w:proofErr w:type="spellStart"/>
             <w:r>
               <w:rPr>
                 <w:rFonts w:ascii="Garamond" w:hAnsi="Garamond"/>
-                <w:sz w:val="24"/>
-                <w:szCs w:val="24"/>
               </w:rPr>
               <w:t>Total_Primera</w:t>
             </w:r>
-            <w:proofErr w:type="spellEnd"/>
           </w:p>
         </w:tc>
         <w:tc>
@@ -546,20 +514,14 @@
             <w:pPr>
               <w:rPr>
                 <w:rFonts w:ascii="Garamond" w:hAnsi="Garamond"/>
-                <w:sz w:val="24"/>
-                <w:szCs w:val="24"/>
               </w:rPr>
             </w:pPr>
-            <w:proofErr w:type="spellStart"/>
             <w:r>
               <w:rPr>
                 <w:rFonts w:ascii="Garamond" w:hAnsi="Garamond"/>
-                <w:sz w:val="24"/>
-                <w:szCs w:val="24"/>
               </w:rPr>
               <w:t>Monto_Total</w:t>
             </w:r>
-            <w:proofErr w:type="spellEnd"/>
           </w:p>
         </w:tc>
       </w:tr>
@@ -582,8 +544,6 @@
             <w:pPr>
               <w:rPr>
                 <w:rFonts w:ascii="Garamond" w:hAnsi="Garamond"/>
-                <w:sz w:val="24"/>
-                <w:szCs w:val="24"/>
               </w:rPr>
             </w:pPr>
           </w:p>
@@ -603,8 +563,6 @@
             <w:pPr>
               <w:rPr>
                 <w:rFonts w:ascii="Garamond" w:hAnsi="Garamond"/>
-                <w:sz w:val="24"/>
-                <w:szCs w:val="24"/>
               </w:rPr>
             </w:pPr>
           </w:p>
@@ -624,8 +582,6 @@
             <w:pPr>
               <w:rPr>
                 <w:rFonts w:ascii="Garamond" w:hAnsi="Garamond"/>
-                <w:sz w:val="24"/>
-                <w:szCs w:val="24"/>
               </w:rPr>
             </w:pPr>
           </w:p>
@@ -644,16 +600,12 @@
               <w:rPr>
                 <w:rFonts w:ascii="Garamond" w:hAnsi="Garamond"/>
                 <w:b/>
-                <w:sz w:val="24"/>
-                <w:szCs w:val="24"/>
               </w:rPr>
             </w:pPr>
             <w:r>
               <w:rPr>
                 <w:rFonts w:ascii="Garamond" w:hAnsi="Garamond"/>
                 <w:b/>
-                <w:sz w:val="24"/>
-                <w:szCs w:val="24"/>
               </w:rPr>
               <w:t>Saldo</w:t>
             </w:r>
@@ -668,20 +620,14 @@
             <w:pPr>
               <w:rPr>
                 <w:rFonts w:ascii="Garamond" w:hAnsi="Garamond"/>
-                <w:sz w:val="24"/>
-                <w:szCs w:val="24"/>
               </w:rPr>
             </w:pPr>
-            <w:proofErr w:type="spellStart"/>
             <w:r>
               <w:rPr>
                 <w:rFonts w:ascii="Garamond" w:hAnsi="Garamond"/>
-                <w:sz w:val="24"/>
-                <w:szCs w:val="24"/>
               </w:rPr>
               <w:t>Saldo_Primera</w:t>
             </w:r>
-            <w:proofErr w:type="spellEnd"/>
           </w:p>
         </w:tc>
       </w:tr>

</xml_diff>